<commit_message>
Added models for simulating and fitting with 1 covariate
</commit_message>
<xml_diff>
--- a/Estimating parameters in fishery models/Estimating-parameters-in-fishery-models.docx
+++ b/Estimating parameters in fishery models/Estimating-parameters-in-fishery-models.docx
@@ -10,13 +10,13 @@
         <w:t xml:space="preserve">Parameter estimation in fishery models</w:t>
       </w:r>
     </w:p>
-    <w:bookmarkStart w:id="28" w:name="outline"/>
+    <w:bookmarkStart w:id="37" w:name="introduction"/>
     <w:p>
       <w:pPr>
         <w:pStyle w:val="Heading1"/>
       </w:pPr>
       <w:r>
-        <w:t xml:space="preserve">Outline</w:t>
+        <w:t xml:space="preserve">Introduction</w:t>
       </w:r>
     </w:p>
     <w:p>
@@ -493,7 +493,7 @@
       </m:oMath>
     </w:p>
     <w:bookmarkEnd w:id="21"/>
-    <w:bookmarkStart w:id="25" w:name="simulation"/>
+    <w:bookmarkStart w:id="34" w:name="simulation"/>
     <w:p>
       <w:pPr>
         <w:pStyle w:val="Heading2"/>
@@ -507,11 +507,32 @@
         <w:pStyle w:val="FirstParagraph"/>
       </w:pPr>
       <w:r>
-        <w:t xml:space="preserve">We simulated data for log recruits per spawner</w:t>
-      </w:r>
-      <w:r>
-        <w:t xml:space="preserve"> </w:t>
-      </w:r>
+        <w:t xml:space="preserve">We simulated the population dynamics of salmon using two spawner recruit models - Ricker and Beverton-Holt. The simulation models containied submodels for recruitment, harvest and age-structure, with natural variability in recruitment, harvest, and age-at-maturity.</w:t>
+      </w:r>
+    </w:p>
+    <w:bookmarkStart w:id="22" w:name="base-model"/>
+    <w:p>
+      <w:pPr>
+        <w:pStyle w:val="Heading3"/>
+      </w:pPr>
+      <w:r>
+        <w:t xml:space="preserve">Base model</w:t>
+      </w:r>
+    </w:p>
+    <w:bookmarkEnd w:id="22"/>
+    <w:bookmarkStart w:id="23" w:name="beverton-holt-equation-1"/>
+    <w:p>
+      <w:pPr>
+        <w:pStyle w:val="Heading3"/>
+      </w:pPr>
+      <w:r>
+        <w:t xml:space="preserve">Beverton-Holt Equation</w:t>
+      </w:r>
+    </w:p>
+    <w:p>
+      <w:pPr>
+        <w:pStyle w:val="FirstParagraph"/>
+      </w:pPr>
       <m:oMath>
         <m:r>
           <m:rPr>
@@ -544,65 +565,749 @@
             </m:f>
           </m:e>
         </m:d>
+        <m:r>
+          <m:rPr>
+            <m:sty m:val="p"/>
+          </m:rPr>
+          <m:t>=</m:t>
+        </m:r>
+        <m:sSup>
+          <m:e>
+            <m:r>
+              <m:t>e</m:t>
+            </m:r>
+          </m:e>
+          <m:sup>
+            <m:r>
+              <m:t>α</m:t>
+            </m:r>
+          </m:sup>
+        </m:sSup>
+        <m:r>
+          <m:rPr>
+            <m:sty m:val="p"/>
+          </m:rPr>
+          <m:t>−</m:t>
+        </m:r>
+        <m:r>
+          <m:rPr>
+            <m:sty m:val="p"/>
+          </m:rPr>
+          <m:t>ln</m:t>
+        </m:r>
+        <m:d>
+          <m:dPr>
+            <m:begChr m:val="("/>
+            <m:sepChr m:val=""/>
+            <m:endChr m:val=")"/>
+            <m:grow/>
+          </m:dPr>
+          <m:e>
+            <m:r>
+              <m:t>1</m:t>
+            </m:r>
+            <m:r>
+              <m:rPr>
+                <m:sty m:val="p"/>
+              </m:rPr>
+              <m:t>+</m:t>
+            </m:r>
+            <m:f>
+              <m:fPr>
+                <m:type m:val="bar"/>
+              </m:fPr>
+              <m:num>
+                <m:sSup>
+                  <m:e>
+                    <m:r>
+                      <m:t>e</m:t>
+                    </m:r>
+                  </m:e>
+                  <m:sup>
+                    <m:r>
+                      <m:t>α</m:t>
+                    </m:r>
+                  </m:sup>
+                </m:sSup>
+                <m:r>
+                  <m:t>S</m:t>
+                </m:r>
+              </m:num>
+              <m:den>
+                <m:sSub>
+                  <m:e>
+                    <m:r>
+                      <m:t>R</m:t>
+                    </m:r>
+                  </m:e>
+                  <m:sub>
+                    <m:r>
+                      <m:t>k</m:t>
+                    </m:r>
+                  </m:sub>
+                </m:sSub>
+              </m:den>
+            </m:f>
+          </m:e>
+        </m:d>
+        <m:r>
+          <m:rPr>
+            <m:sty m:val="p"/>
+          </m:rPr>
+          <m:t>+</m:t>
+        </m:r>
+        <m:r>
+          <m:t>ϵ</m:t>
+        </m:r>
       </m:oMath>
-      <w:r>
-        <w:t xml:space="preserve">, also known as productivity, with the Beverton-Holt equation and the Ricker equation with randomly drawn values of</w:t>
-      </w:r>
-      <w:r>
-        <w:t xml:space="preserve"> </w:t>
-      </w:r>
+    </w:p>
+    <w:p>
+      <w:pPr>
+        <w:pStyle w:val="BodyText"/>
+      </w:pPr>
       <m:oMath>
+        <m:sSub>
+          <m:e>
+            <m:r>
+              <m:t>R</m:t>
+            </m:r>
+          </m:e>
+          <m:sub>
+            <m:r>
+              <m:t>K</m:t>
+            </m:r>
+          </m:sub>
+        </m:sSub>
+        <m:r>
+          <m:rPr>
+            <m:sty m:val="p"/>
+          </m:rPr>
+          <m:t>=</m:t>
+        </m:r>
+        <m:f>
+          <m:fPr>
+            <m:type m:val="bar"/>
+          </m:fPr>
+          <m:num>
+            <m:r>
+              <m:t>K</m:t>
+            </m:r>
+          </m:num>
+          <m:den>
+            <m:sSup>
+              <m:e>
+                <m:r>
+                  <m:t>e</m:t>
+                </m:r>
+              </m:e>
+              <m:sup>
+                <m:r>
+                  <m:t>α</m:t>
+                </m:r>
+              </m:sup>
+            </m:sSup>
+            <m:r>
+              <m:rPr>
+                <m:sty m:val="p"/>
+              </m:rPr>
+              <m:t>−</m:t>
+            </m:r>
+            <m:r>
+              <m:t>1</m:t>
+            </m:r>
+          </m:den>
+        </m:f>
+      </m:oMath>
+    </w:p>
+    <w:p>
+      <w:pPr>
+        <w:pStyle w:val="BodyText"/>
+      </w:pPr>
+      <m:oMath>
+        <m:sSub>
+          <m:e>
+            <m:r>
+              <m:t>S</m:t>
+            </m:r>
+          </m:e>
+          <m:sub>
+            <m:r>
+              <m:t>M</m:t>
+            </m:r>
+            <m:r>
+              <m:t>S</m:t>
+            </m:r>
+            <m:r>
+              <m:t>Y</m:t>
+            </m:r>
+          </m:sub>
+        </m:sSub>
+        <m:r>
+          <m:rPr>
+            <m:sty m:val="p"/>
+          </m:rPr>
+          <m:t>=</m:t>
+        </m:r>
+        <m:f>
+          <m:fPr>
+            <m:type m:val="bar"/>
+          </m:fPr>
+          <m:num>
+            <m:r>
+              <m:t>K</m:t>
+            </m:r>
+          </m:num>
+          <m:den>
+            <m:sSup>
+              <m:e>
+                <m:r>
+                  <m:t>e</m:t>
+                </m:r>
+              </m:e>
+              <m:sup>
+                <m:f>
+                  <m:fPr>
+                    <m:type m:val="bar"/>
+                  </m:fPr>
+                  <m:num>
+                    <m:r>
+                      <m:t>α</m:t>
+                    </m:r>
+                  </m:num>
+                  <m:den>
+                    <m:r>
+                      <m:t>2</m:t>
+                    </m:r>
+                  </m:den>
+                </m:f>
+              </m:sup>
+            </m:sSup>
+            <m:r>
+              <m:rPr>
+                <m:sty m:val="p"/>
+              </m:rPr>
+              <m:t>+</m:t>
+            </m:r>
+            <m:r>
+              <m:t>1</m:t>
+            </m:r>
+          </m:den>
+        </m:f>
+      </m:oMath>
+    </w:p>
+    <w:p>
+      <w:pPr>
+        <w:pStyle w:val="BodyText"/>
+      </w:pPr>
+      <m:oMath>
+        <m:r>
+          <m:t>ϵ</m:t>
+        </m:r>
+        <m:r>
+          <m:rPr>
+            <m:sty m:val="p"/>
+          </m:rPr>
+          <m:t>∼</m:t>
+        </m:r>
+        <m:r>
+          <m:t>N</m:t>
+        </m:r>
+        <m:d>
+          <m:dPr>
+            <m:begChr m:val="("/>
+            <m:sepChr m:val=""/>
+            <m:endChr m:val=")"/>
+            <m:grow/>
+          </m:dPr>
+          <m:e>
+            <m:r>
+              <m:t>0</m:t>
+            </m:r>
+            <m:r>
+              <m:rPr>
+                <m:sty m:val="p"/>
+              </m:rPr>
+              <m:t>,</m:t>
+            </m:r>
+            <m:r>
+              <m:t>σ</m:t>
+            </m:r>
+          </m:e>
+        </m:d>
+      </m:oMath>
+    </w:p>
+    <w:bookmarkEnd w:id="23"/>
+    <w:bookmarkStart w:id="33" w:name="ricker-equation-1"/>
+    <w:p>
+      <w:pPr>
+        <w:pStyle w:val="Heading3"/>
+      </w:pPr>
+      <w:r>
+        <w:t xml:space="preserve">Ricker Equation</w:t>
+      </w:r>
+    </w:p>
+    <w:p>
+      <w:pPr>
+        <w:pStyle w:val="FirstParagraph"/>
+      </w:pPr>
+      <m:oMath>
+        <m:r>
+          <m:rPr>
+            <m:sty m:val="p"/>
+          </m:rPr>
+          <m:t>ln</m:t>
+        </m:r>
+        <m:d>
+          <m:dPr>
+            <m:begChr m:val="("/>
+            <m:sepChr m:val=""/>
+            <m:endChr m:val=")"/>
+            <m:grow/>
+          </m:dPr>
+          <m:e>
+            <m:f>
+              <m:fPr>
+                <m:type m:val="bar"/>
+              </m:fPr>
+              <m:num>
+                <m:r>
+                  <m:t>R</m:t>
+                </m:r>
+              </m:num>
+              <m:den>
+                <m:r>
+                  <m:t>S</m:t>
+                </m:r>
+              </m:den>
+            </m:f>
+          </m:e>
+        </m:d>
+        <m:r>
+          <m:rPr>
+            <m:sty m:val="p"/>
+          </m:rPr>
+          <m:t>=</m:t>
+        </m:r>
         <m:r>
           <m:t>α</m:t>
         </m:r>
+        <m:r>
+          <m:rPr>
+            <m:sty m:val="p"/>
+          </m:rPr>
+          <m:t>−</m:t>
+        </m:r>
+        <m:f>
+          <m:fPr>
+            <m:type m:val="bar"/>
+          </m:fPr>
+          <m:num>
+            <m:r>
+              <m:t>S</m:t>
+            </m:r>
+          </m:num>
+          <m:den>
+            <m:sSub>
+              <m:e>
+                <m:r>
+                  <m:t>S</m:t>
+                </m:r>
+              </m:e>
+              <m:sub>
+                <m:r>
+                  <m:t>m</m:t>
+                </m:r>
+                <m:r>
+                  <m:t>a</m:t>
+                </m:r>
+                <m:r>
+                  <m:t>x</m:t>
+                </m:r>
+              </m:sub>
+            </m:sSub>
+          </m:den>
+        </m:f>
+        <m:r>
+          <m:rPr>
+            <m:sty m:val="p"/>
+          </m:rPr>
+          <m:t>+</m:t>
+        </m:r>
+        <m:r>
+          <m:t>ϵ</m:t>
+        </m:r>
       </m:oMath>
-      <w:r>
-        <w:t xml:space="preserve">,</w:t>
-      </w:r>
-      <w:r>
-        <w:t xml:space="preserve"> </w:t>
-      </w:r>
+    </w:p>
+    <w:p>
+      <w:pPr>
+        <w:pStyle w:val="BodyText"/>
+      </w:pPr>
       <m:oMath>
-        <m:r>
-          <m:t>σ</m:t>
-        </m:r>
+        <m:sSub>
+          <m:e>
+            <m:r>
+              <m:t>S</m:t>
+            </m:r>
+          </m:e>
+          <m:sub>
+            <m:r>
+              <m:t>m</m:t>
+            </m:r>
+            <m:r>
+              <m:t>a</m:t>
+            </m:r>
+            <m:r>
+              <m:t>x</m:t>
+            </m:r>
+          </m:sub>
+        </m:sSub>
+        <m:r>
+          <m:rPr>
+            <m:sty m:val="p"/>
+          </m:rPr>
+          <m:t>=</m:t>
+        </m:r>
+        <m:f>
+          <m:fPr>
+            <m:type m:val="bar"/>
+          </m:fPr>
+          <m:num>
+            <m:r>
+              <m:t>K</m:t>
+            </m:r>
+          </m:num>
+          <m:den>
+            <m:r>
+              <m:t>α</m:t>
+            </m:r>
+          </m:den>
+        </m:f>
       </m:oMath>
-      <w:r>
-        <w:t xml:space="preserve">,</w:t>
-      </w:r>
-      <w:r>
-        <w:t xml:space="preserve"> </w:t>
-      </w:r>
+    </w:p>
+    <w:p>
+      <w:pPr>
+        <w:pStyle w:val="BodyText"/>
+      </w:pPr>
       <m:oMath>
-        <m:r>
-          <m:t>K</m:t>
-        </m:r>
+        <m:sSub>
+          <m:e>
+            <m:r>
+              <m:t>S</m:t>
+            </m:r>
+          </m:e>
+          <m:sub>
+            <m:r>
+              <m:t>M</m:t>
+            </m:r>
+            <m:r>
+              <m:t>S</m:t>
+            </m:r>
+            <m:r>
+              <m:t>Y</m:t>
+            </m:r>
+          </m:sub>
+        </m:sSub>
+        <m:r>
+          <m:rPr>
+            <m:sty m:val="p"/>
+          </m:rPr>
+          <m:t>=</m:t>
+        </m:r>
+        <m:d>
+          <m:dPr>
+            <m:begChr m:val="("/>
+            <m:sepChr m:val=""/>
+            <m:endChr m:val=")"/>
+            <m:grow/>
+          </m:dPr>
+          <m:e>
+            <m:r>
+              <m:t>1</m:t>
+            </m:r>
+            <m:r>
+              <m:rPr>
+                <m:sty m:val="p"/>
+              </m:rPr>
+              <m:t>−</m:t>
+            </m:r>
+            <m:sSub>
+              <m:e>
+                <m:r>
+                  <m:t>W</m:t>
+                </m:r>
+              </m:e>
+              <m:sub>
+                <m:r>
+                  <m:t>0</m:t>
+                </m:r>
+              </m:sub>
+            </m:sSub>
+            <m:d>
+              <m:dPr>
+                <m:begChr m:val="("/>
+                <m:sepChr m:val=""/>
+                <m:endChr m:val=")"/>
+                <m:grow/>
+              </m:dPr>
+              <m:e>
+                <m:sSup>
+                  <m:e>
+                    <m:r>
+                      <m:t>e</m:t>
+                    </m:r>
+                  </m:e>
+                  <m:sup>
+                    <m:r>
+                      <m:t>1</m:t>
+                    </m:r>
+                    <m:r>
+                      <m:rPr>
+                        <m:sty m:val="p"/>
+                      </m:rPr>
+                      <m:t>−</m:t>
+                    </m:r>
+                    <m:r>
+                      <m:t>α</m:t>
+                    </m:r>
+                  </m:sup>
+                </m:sSup>
+              </m:e>
+            </m:d>
+          </m:e>
+        </m:d>
+        <m:sSub>
+          <m:e>
+            <m:r>
+              <m:t>S</m:t>
+            </m:r>
+          </m:e>
+          <m:sub>
+            <m:r>
+              <m:t>m</m:t>
+            </m:r>
+            <m:r>
+              <m:t>a</m:t>
+            </m:r>
+            <m:r>
+              <m:t>x</m:t>
+            </m:r>
+          </m:sub>
+        </m:sSub>
       </m:oMath>
-      <w:r>
-        <w:t xml:space="preserve">, and with empirical spawner data. We then fit both the Beverton-Holt model and the Ricker model in Bayesian framework to this data to estimate the same parameters. We plotted the median estimates of these parameters with 95% credible intervals along with the true values of the parameters to evaluate the accuracy and precision of the parameter estimates.</w:t>
-      </w:r>
     </w:p>
     <w:p>
       <w:pPr>
         <w:pStyle w:val="BodyText"/>
+      </w:pPr>
+      <m:oMath>
+        <m:r>
+          <m:t>ϵ</m:t>
+        </m:r>
+        <m:r>
+          <m:rPr>
+            <m:sty m:val="p"/>
+          </m:rPr>
+          <m:t>∼</m:t>
+        </m:r>
+        <m:r>
+          <m:t>N</m:t>
+        </m:r>
+        <m:d>
+          <m:dPr>
+            <m:begChr m:val="("/>
+            <m:sepChr m:val=""/>
+            <m:endChr m:val=")"/>
+            <m:grow/>
+          </m:dPr>
+          <m:e>
+            <m:r>
+              <m:t>0</m:t>
+            </m:r>
+            <m:r>
+              <m:rPr>
+                <m:sty m:val="p"/>
+              </m:rPr>
+              <m:t>,</m:t>
+            </m:r>
+            <m:r>
+              <m:t>σ</m:t>
+            </m:r>
+          </m:e>
+        </m:d>
+      </m:oMath>
+    </w:p>
+    <w:p>
+      <w:pPr>
+        <w:pStyle w:val="BodyText"/>
+      </w:pPr>
+      <w:r>
+        <w:t xml:space="preserve">graph TD</w:t>
+      </w:r>
+    </w:p>
+    <w:p>
+      <w:pPr>
+        <w:pStyle w:val="SourceCode"/>
+      </w:pPr>
+      <w:r>
+        <w:rPr>
+          <w:rStyle w:val="VerbatimChar"/>
+        </w:rPr>
+        <w:t xml:space="preserve">A[Start Simulation] --\&gt; B[Initialize Spawners near K&lt;br/&gt;for t = 1 to max_age] B --\&gt; C{Is t \&gt; max_age?}</w:t>
+      </w:r>
+      <w:r>
+        <w:br/>
+      </w:r>
+      <w:r>
+        <w:br/>
+      </w:r>
+      <w:r>
+        <w:rPr>
+          <w:rStyle w:val="VerbatimChar"/>
+        </w:rPr>
+        <w:t xml:space="preserve">         </w:t>
+      </w:r>
+      <w:r>
+        <w:br/>
+      </w:r>
+      <w:r>
+        <w:rPr>
+          <w:rStyle w:val="VerbatimChar"/>
+        </w:rPr>
+        <w:t xml:space="preserve">C -- Yes --&gt; D[Calculate Run Size:&lt;br/&gt;Sum returning ages from past brood years]</w:t>
+      </w:r>
+      <w:r>
+        <w:br/>
+      </w:r>
+      <w:r>
+        <w:rPr>
+          <w:rStyle w:val="VerbatimChar"/>
+        </w:rPr>
+        <w:t xml:space="preserve">D --&gt; E[Apply Harvest Rate:&lt;br/&gt;Calculate Escapement]</w:t>
+      </w:r>
+      <w:r>
+        <w:br/>
+      </w:r>
+      <w:r>
+        <w:br/>
+      </w:r>
+      <w:r>
+        <w:rPr>
+          <w:rStyle w:val="VerbatimChar"/>
+        </w:rPr>
+        <w:t xml:space="preserve">C -- No --&gt; F</w:t>
+      </w:r>
+      <w:r>
+        <w:br/>
+      </w:r>
+      <w:r>
+        <w:rPr>
+          <w:rStyle w:val="VerbatimChar"/>
+        </w:rPr>
+        <w:t xml:space="preserve">E --&gt; F[Calculate Recruitment:&lt;br/&gt;Apply Ricker Model with environmental noise]</w:t>
+      </w:r>
+      <w:r>
+        <w:br/>
+      </w:r>
+      <w:r>
+        <w:br/>
+      </w:r>
+      <w:r>
+        <w:rPr>
+          <w:rStyle w:val="VerbatimChar"/>
+        </w:rPr>
+        <w:t xml:space="preserve">F --&gt; G{Is Simulation Complete?}</w:t>
+      </w:r>
+      <w:r>
+        <w:br/>
+      </w:r>
+      <w:r>
+        <w:rPr>
+          <w:rStyle w:val="VerbatimChar"/>
+        </w:rPr>
+        <w:t xml:space="preserve">G -- No --&gt; C</w:t>
+      </w:r>
+      <w:r>
+        <w:br/>
+      </w:r>
+      <w:r>
+        <w:br/>
+      </w:r>
+      <w:r>
+        <w:rPr>
+          <w:rStyle w:val="VerbatimChar"/>
+        </w:rPr>
+        <w:t xml:space="preserve">G -- Yes --&gt; H[Discard Burn-in Period]</w:t>
+      </w:r>
+      <w:r>
+        <w:br/>
+      </w:r>
+      <w:r>
+        <w:rPr>
+          <w:rStyle w:val="VerbatimChar"/>
+        </w:rPr>
+        <w:t xml:space="preserve">H --&gt; I[Calculate Derived Benchmarks&lt;br/&gt;e.g., S_MSY]</w:t>
+      </w:r>
+      <w:r>
+        <w:br/>
+      </w:r>
+      <w:r>
+        <w:rPr>
+          <w:rStyle w:val="VerbatimChar"/>
+        </w:rPr>
+        <w:t xml:space="preserve">I --&gt; J[Final Time Series Data]</w:t>
+      </w:r>
+      <w:r>
+        <w:br/>
+      </w:r>
+      <w:r>
+        <w:br/>
+      </w:r>
+      <w:r>
+        <w:rPr>
+          <w:rStyle w:val="VerbatimChar"/>
+        </w:rPr>
+        <w:t xml:space="preserve">classDef default fill:#f9f9f9,stroke:#333,stroke-width:1px;</w:t>
+      </w:r>
+      <w:r>
+        <w:br/>
+      </w:r>
+      <w:r>
+        <w:rPr>
+          <w:rStyle w:val="VerbatimChar"/>
+        </w:rPr>
+        <w:t xml:space="preserve">classDef process fill:#e1f5fe,stroke:#36a2eb,stroke-width:2px;</w:t>
+      </w:r>
+      <w:r>
+        <w:br/>
+      </w:r>
+      <w:r>
+        <w:rPr>
+          <w:rStyle w:val="VerbatimChar"/>
+        </w:rPr>
+        <w:t xml:space="preserve">class D,E,F process;</w:t>
+      </w:r>
+    </w:p>
+    <w:p>
+      <w:pPr>
+        <w:pStyle w:val="FirstParagraph"/>
       </w:pPr>
       <w:r>
         <w:drawing>
           <wp:inline>
             <wp:extent cx="5334000" cy="3809999"/>
             <wp:effectExtent b="0" l="0" r="0" t="0"/>
-            <wp:docPr descr="" title="" id="23" name="Picture"/>
+            <wp:docPr descr="" title="" id="25" name="Picture"/>
             <a:graphic>
               <a:graphicData uri="http://schemas.openxmlformats.org/drawingml/2006/picture">
                 <pic:pic>
                   <pic:nvPicPr>
-                    <pic:cNvPr descr="Estimating-parameters-in-fishery-models_files/figure-docx/unnamed-chunk-1-1.png" id="24" name="Picture"/>
+                    <pic:cNvPr descr="Estimating-parameters-in-fishery-models_files/figure-docx/unnamed-chunk-1-1.png" id="26" name="Picture"/>
                     <pic:cNvPicPr>
                       <a:picLocks noChangeArrowheads="1" noChangeAspect="1"/>
                     </pic:cNvPicPr>
                   </pic:nvPicPr>
                   <pic:blipFill>
-                    <a:blip r:embed="rId22"/>
+                    <a:blip r:embed="rId24"/>
                     <a:stretch>
                       <a:fillRect/>
                     </a:stretch>
@@ -634,6 +1339,95 @@
         <w:pStyle w:val="BodyText"/>
       </w:pPr>
       <w:r>
+        <w:drawing>
+          <wp:inline>
+            <wp:extent cx="5334000" cy="3809999"/>
+            <wp:effectExtent b="0" l="0" r="0" t="0"/>
+            <wp:docPr descr="" title="" id="28" name="Picture"/>
+            <a:graphic>
+              <a:graphicData uri="http://schemas.openxmlformats.org/drawingml/2006/picture">
+                <pic:pic>
+                  <pic:nvPicPr>
+                    <pic:cNvPr descr="Estimating-parameters-in-fishery-models_files/figure-docx/unnamed-chunk-2-1.png" id="29" name="Picture"/>
+                    <pic:cNvPicPr>
+                      <a:picLocks noChangeArrowheads="1" noChangeAspect="1"/>
+                    </pic:cNvPicPr>
+                  </pic:nvPicPr>
+                  <pic:blipFill>
+                    <a:blip r:embed="rId27"/>
+                    <a:stretch>
+                      <a:fillRect/>
+                    </a:stretch>
+                  </pic:blipFill>
+                  <pic:spPr bwMode="auto">
+                    <a:xfrm>
+                      <a:off x="0" y="0"/>
+                      <a:ext cx="5334000" cy="3809999"/>
+                    </a:xfrm>
+                    <a:prstGeom prst="rect">
+                      <a:avLst/>
+                    </a:prstGeom>
+                    <a:noFill/>
+                    <a:ln w="9525">
+                      <a:noFill/>
+                      <a:headEnd/>
+                      <a:tailEnd/>
+                    </a:ln>
+                  </pic:spPr>
+                </pic:pic>
+              </a:graphicData>
+            </a:graphic>
+          </wp:inline>
+        </w:drawing>
+      </w:r>
+      <w:r>
+        <w:drawing>
+          <wp:inline>
+            <wp:extent cx="5334000" cy="3809999"/>
+            <wp:effectExtent b="0" l="0" r="0" t="0"/>
+            <wp:docPr descr="" title="" id="31" name="Picture"/>
+            <a:graphic>
+              <a:graphicData uri="http://schemas.openxmlformats.org/drawingml/2006/picture">
+                <pic:pic>
+                  <pic:nvPicPr>
+                    <pic:cNvPr descr="Estimating-parameters-in-fishery-models_files/figure-docx/unnamed-chunk-2-2.png" id="32" name="Picture"/>
+                    <pic:cNvPicPr>
+                      <a:picLocks noChangeArrowheads="1" noChangeAspect="1"/>
+                    </pic:cNvPicPr>
+                  </pic:nvPicPr>
+                  <pic:blipFill>
+                    <a:blip r:embed="rId30"/>
+                    <a:stretch>
+                      <a:fillRect/>
+                    </a:stretch>
+                  </pic:blipFill>
+                  <pic:spPr bwMode="auto">
+                    <a:xfrm>
+                      <a:off x="0" y="0"/>
+                      <a:ext cx="5334000" cy="3809999"/>
+                    </a:xfrm>
+                    <a:prstGeom prst="rect">
+                      <a:avLst/>
+                    </a:prstGeom>
+                    <a:noFill/>
+                    <a:ln w="9525">
+                      <a:noFill/>
+                      <a:headEnd/>
+                      <a:tailEnd/>
+                    </a:ln>
+                  </pic:spPr>
+                </pic:pic>
+              </a:graphicData>
+            </a:graphic>
+          </wp:inline>
+        </w:drawing>
+      </w:r>
+    </w:p>
+    <w:p>
+      <w:pPr>
+        <w:pStyle w:val="BodyText"/>
+      </w:pPr>
+      <w:r>
         <w:t xml:space="preserve">To do:</w:t>
       </w:r>
     </w:p>
@@ -842,8 +1636,9 @@
         <w:t xml:space="preserve">and plot the distribution of estimated medians.</w:t>
       </w:r>
     </w:p>
-    <w:bookmarkEnd w:id="25"/>
-    <w:bookmarkStart w:id="26" w:name="profile-likelihoods"/>
+    <w:bookmarkEnd w:id="33"/>
+    <w:bookmarkEnd w:id="34"/>
+    <w:bookmarkStart w:id="35" w:name="profile-likelihoods"/>
     <w:p>
       <w:pPr>
         <w:pStyle w:val="Heading2"/>
@@ -926,8 +1721,8 @@
         <w:t xml:space="preserve">Plot the profile likelihood of the model parameters for multiple datasets</w:t>
       </w:r>
     </w:p>
-    <w:bookmarkEnd w:id="26"/>
-    <w:bookmarkStart w:id="27" w:name="significance"/>
+    <w:bookmarkEnd w:id="35"/>
+    <w:bookmarkStart w:id="36" w:name="significance"/>
     <w:p>
       <w:pPr>
         <w:pStyle w:val="Heading2"/>
@@ -984,9 +1779,9 @@
         <w:t xml:space="preserve">Using a Bayesian approach allows us to quantify the full uncertainty associated with all parameters and metrics of interest, such as harvest targets. However, having high levels of uncetainty are unhelpful with management decisions. It is useful to know when the model structure leads to high levels of uncertainty in the parameters and metrics of interest. We can then use this information to make informed decisions about which model to use for specific datasets and to be cautious about the interpretation of the results.</w:t>
       </w:r>
     </w:p>
-    <w:bookmarkEnd w:id="27"/>
-    <w:bookmarkEnd w:id="28"/>
-    <w:bookmarkStart w:id="35" w:name="references"/>
+    <w:bookmarkEnd w:id="36"/>
+    <w:bookmarkEnd w:id="37"/>
+    <w:bookmarkStart w:id="44" w:name="references"/>
     <w:p>
       <w:pPr>
         <w:pStyle w:val="Heading1"/>
@@ -995,8 +1790,8 @@
         <w:t xml:space="preserve">References</w:t>
       </w:r>
     </w:p>
-    <w:bookmarkStart w:id="34" w:name="refs"/>
-    <w:bookmarkStart w:id="30" w:name="ref-Raue_2009"/>
+    <w:bookmarkStart w:id="43" w:name="refs"/>
+    <w:bookmarkStart w:id="39" w:name="ref-Raue_2009"/>
     <w:p>
       <w:pPr>
         <w:pStyle w:val="Bibliography"/>
@@ -1013,7 +1808,7 @@
       <w:r>
         <w:t xml:space="preserve">Raue A, Kreutz C, Maiwald T, Bachmann J, Schilling M, Klingmüller U, et al. Structural and practical identifiability analysis of partially observed dynamical models by exploiting the profile likelihood. Bioinformatics. 2009;25: 1923–1929. doi:</w:t>
       </w:r>
-      <w:hyperlink r:id="rId29">
+      <w:hyperlink r:id="rId38">
         <w:r>
           <w:rPr>
             <w:rStyle w:val="Hyperlink"/>
@@ -1022,8 +1817,8 @@
         </w:r>
       </w:hyperlink>
     </w:p>
-    <w:bookmarkEnd w:id="30"/>
-    <w:bookmarkStart w:id="32" w:name="ref-Zhou_2007"/>
+    <w:bookmarkEnd w:id="39"/>
+    <w:bookmarkStart w:id="41" w:name="ref-Zhou_2007"/>
     <w:p>
       <w:pPr>
         <w:pStyle w:val="Bibliography"/>
@@ -1040,7 +1835,7 @@
       <w:r>
         <w:t xml:space="preserve">Zhou S. Discriminating alternative stock–recruitment models and evaluating uncertainty in model structure. Fisheries Research. 2007;86: 268–279. doi:</w:t>
       </w:r>
-      <w:hyperlink r:id="rId31">
+      <w:hyperlink r:id="rId40">
         <w:r>
           <w:rPr>
             <w:rStyle w:val="Hyperlink"/>
@@ -1049,8 +1844,8 @@
         </w:r>
       </w:hyperlink>
     </w:p>
-    <w:bookmarkEnd w:id="32"/>
-    <w:bookmarkStart w:id="33" w:name="ref-Godbout_Fu_Irvine"/>
+    <w:bookmarkEnd w:id="41"/>
+    <w:bookmarkStart w:id="42" w:name="ref-Godbout_Fu_Irvine"/>
     <w:p>
       <w:pPr>
         <w:pStyle w:val="Bibliography"/>
@@ -1071,9 +1866,9 @@
         <w:t xml:space="preserve"> </w:t>
       </w:r>
     </w:p>
-    <w:bookmarkEnd w:id="33"/>
-    <w:bookmarkEnd w:id="34"/>
-    <w:bookmarkEnd w:id="35"/>
+    <w:bookmarkEnd w:id="42"/>
+    <w:bookmarkEnd w:id="43"/>
+    <w:bookmarkEnd w:id="44"/>
     <w:sectPr>
       <w:footnotePr>
         <w:numRestart w:val="eachSect"/>

</xml_diff>